<commit_message>
Expand Administration Report to all approved general requests
</commit_message>
<xml_diff>
--- a/docs/manuals/ADMIN_GUIDE_EN.docx
+++ b/docs/manuals/ADMIN_GUIDE_EN.docx
@@ -4881,22 +4881,22 @@
     </ns0:p>
     <ns0:p>
       <ns0:r>
-        <ns0:t>Selected employees can use Administration Report to search, view and print fully approved General Requests addressed to Administration, including requests submitted by other departments. In Django Admin &gt; Accounts &gt; Users, enable Can view administration reports (can_view_administration_reports) for each authorized employee. This follows Stock Report's user-flag mechanism; group permissions do not grant this flag. Superusers also have access.</ns0:t>
-      </ns0:r>
-    </ns0:p>
-    <ns0:p>
-      <ns0:r>
-        <ns0:t>Search by request number, requester names/username or description. Filter by submitting department, requester and submission date range; filters survive pagination. The destination remains Administration. Open View Document or Print, then use the existing document's print/save-as-PDF button and one/two-copy controls.</ns0:t>
-      </ns0:r>
-    </ns0:p>
-    <ns0:p>
-      <ns0:r>
-        <ns0:t>Access covers only the report and its approved documents. It does not grant request-detail, editing or approval rights. Drafts and all other unapproved statuses, materials, permission requests and other types are excluded. Dates of approval use existing finalized_at when available.</ns0:t>
-      </ns0:r>
-    </ns0:p>
-    <ns0:p>
-      <ns0:r>
-        <ns0:t>Deployment: apply accounts migration 0003_user_can_view_administration_reports. Confirm the existing department/type codes and set ADMINISTRATION_REPORT_DEPARTMENT_CODE (default ADMIN) and ADMINISTRATION_REPORT_REQUEST_TYPE_CODE (default AUTORISATION_GENERAL) in the environment. These exact codes determine report and document scope; missing codes produce an empty report. No department-name guessing or data changes occur.</ns0:t>
+        <ns0:t>Selected employees can use Administration Report to search, view and print all fully approved General Authorization requests, regardless of submitting or intended department. In Django Admin &gt; Accounts &gt; Users, enable Can view administration reports (can_view_administration_reports) for each authorized employee. This follows Stock Report's user-flag mechanism; group permissions do not grant this flag. Superusers also have access.</ns0:t>
+      </ns0:r>
+    </ns0:p>
+    <ns0:p>
+      <ns0:r>
+        <ns0:t>Search by request number, requester names/username or description. Filter by submitting department, Request For Department, requester and submission date range; filters survive pagination. Both department filters are optional and only narrow the approved General Authorization dataset. Open View Document or Print, then use the existing document's print/save-as-PDF button and one/two-copy controls.</ns0:t>
+      </ns0:r>
+    </ns0:p>
+    <ns0:p>
+      <ns0:r>
+        <ns0:t>Access covers only the report and its approved documents. It does not grant request-detail, editing or approval rights. Drafts and all other unapproved statuses and other request types (including MATERIAL) are excluded. Dates of approval use existing finalized_at when available.</ns0:t>
+      </ns0:r>
+    </ns0:p>
+    <ns0:p>
+      <ns0:r>
+        <ns0:t>Deployment: apply accounts migration 0003_user_can_view_administration_reports. Set ADMINISTRATION_REPORT_REQUEST_TYPE_CODE (default AUTORISATION_GENERAL) in the environment. Membership depends solely on approved status and this request type code. There is no department restriction or department-code setting. No database records are changed.</ns0:t>
       </ns0:r>
     </ns0:p>
     <ns0:sectPr>

</xml_diff>